<commit_message>
feat: relatorio de pendencias dos leitores (RF-052)
Ultimo requisito funcional da v1.0 que seguia em aberto. O bloqueio do
inadimplente ja existia (RF-025), mas nao havia como perguntar "quem
esta devendo?" sem abrir usuario por usuario.

O relatorio cobre as duas causas de bloqueio, nao so a multa: quem ainda
esta com o livro em casa depois do prazo aparece na lista mesmo sem
multa lancada, porque ela so nasce na devolucao -- e esse e o caso mais
urgente, ja que o livro esta fora da biblioteca. Dai a ordenacao pelo
atraso mais antigo, e o e-mail e a turma no CSV: a lista costuma virar
cobranca.
</commit_message>
<xml_diff>
--- a/docs/SIGBEF_Documento_Requisitos.docx
+++ b/docs/SIGBEF_Documento_Requisitos.docx
@@ -5325,11 +5325,11 @@
               <w:rPr>
                 <w:b/>
                 <w:bCs/>
-                <w:color w:val="EF6C00"/>
-                <w:sz w:val="19"/>
-                <w:szCs w:val="19"/>
-              </w:rPr>
-              <w:t xml:space="preserve">Não atendido</w:t>
+                <w:color w:val="2E7D32"/>
+                <w:sz w:val="19"/>
+                <w:szCs w:val="19"/>
+              </w:rPr>
+              <w:t xml:space="preserve">Atendido</w:t>
             </w:r>
           </w:p>
         </w:tc>
@@ -5355,7 +5355,7 @@
                 <w:sz w:val="19"/>
                 <w:szCs w:val="19"/>
               </w:rPr>
-              <w:t xml:space="preserve">Não há relatório de usuários com multa em aberto. O bloqueio funciona (RF-025) e a multa aparece na ficha do usuário, mas falta a listagem.</w:t>
+              <w:t xml:space="preserve">Relatório "Pendências dos leitores": cobre as duas causas de bloqueio — multa em aberto e exemplar atrasado —, com contato e dias de atraso.</w:t>
             </w:r>
           </w:p>
         </w:tc>
@@ -6781,19 +6781,7 @@
         <w:spacing w:after="120"/>
       </w:pPr>
       <w:r>
-        <w:t xml:space="preserve">Dois requisitos da versão 1.0 não foram atendidos, e é melhor registrá-los do que deixá-los como promessa silenciosa:</w:t>
-      </w:r>
-    </w:p>
-    <w:p>
-      <w:pPr>
-        <w:spacing w:after="120"/>
-      </w:pPr>
-      <w:r>
-        <w:rPr>
-          <w:sz w:val="21"/>
-          <w:szCs w:val="21"/>
-        </w:rPr>
-        <w:t xml:space="preserve">RF-052 — Relatório de inadimplência. O sistema bloqueia o usuário com multa em aberto (RF-025) e mostra a multa na ficha dele, mas não existe uma listagem dos inadimplentes para exportar. É um acréscimo pequeno aos relatórios já existentes.</w:t>
+        <w:t xml:space="preserve">Um requisito da versão 1.0 continua sem atendimento, e é melhor registrá-lo do que deixá-lo como promessa silenciosa:</w:t>
       </w:r>
     </w:p>
     <w:p>
@@ -9106,7 +9094,7 @@
                 <w:sz w:val="19"/>
                 <w:szCs w:val="19"/>
               </w:rPr>
-              <w:t xml:space="preserve">Relatório de inadimplência (RF-052)</w:t>
+              <w:t xml:space="preserve">Camada de engajamento de leitura no aplicativo</w:t>
             </w:r>
           </w:p>
         </w:tc>
@@ -9131,7 +9119,7 @@
                 <w:sz w:val="19"/>
                 <w:szCs w:val="19"/>
               </w:rPr>
-              <w:t xml:space="preserve">A implementar</w:t>
+              <w:t xml:space="preserve">Entregue na v1.6.2</w:t>
             </w:r>
           </w:p>
         </w:tc>
@@ -9159,7 +9147,7 @@
                 <w:sz w:val="19"/>
                 <w:szCs w:val="19"/>
               </w:rPr>
-              <w:t xml:space="preserve">Camada de engajamento de leitura no aplicativo</w:t>
+              <w:t xml:space="preserve">Assinatura e distribuição do APK</w:t>
             </w:r>
           </w:p>
         </w:tc>
@@ -9185,7 +9173,7 @@
                 <w:sz w:val="19"/>
                 <w:szCs w:val="19"/>
               </w:rPr>
-              <w:t xml:space="preserve">Entregue na v1.6.2</w:t>
+              <w:t xml:space="preserve">Depende da geração da chave</w:t>
             </w:r>
           </w:p>
         </w:tc>
@@ -9212,7 +9200,7 @@
                 <w:sz w:val="19"/>
                 <w:szCs w:val="19"/>
               </w:rPr>
-              <w:t xml:space="preserve">Assinatura e distribuição do APK</w:t>
+              <w:t xml:space="preserve">Classificação CDD/CDU e etiqueta de lombada</w:t>
             </w:r>
           </w:p>
         </w:tc>
@@ -9237,7 +9225,7 @@
                 <w:sz w:val="19"/>
                 <w:szCs w:val="19"/>
               </w:rPr>
-              <w:t xml:space="preserve">Depende da geração da chave</w:t>
+              <w:t xml:space="preserve">Avaliação futura</w:t>
             </w:r>
           </w:p>
         </w:tc>
@@ -9265,7 +9253,7 @@
                 <w:sz w:val="19"/>
                 <w:szCs w:val="19"/>
               </w:rPr>
-              <w:t xml:space="preserve">Classificação CDD/CDU e etiqueta de lombada</w:t>
+              <w:t xml:space="preserve">Exportação em MARC21</w:t>
             </w:r>
           </w:p>
         </w:tc>
@@ -9291,7 +9279,7 @@
                 <w:sz w:val="19"/>
                 <w:szCs w:val="19"/>
               </w:rPr>
-              <w:t xml:space="preserve">Avaliação futura</w:t>
+              <w:t xml:space="preserve">Avaliação futura, para migração a sistema profissional</w:t>
             </w:r>
           </w:p>
         </w:tc>
@@ -9318,67 +9306,13 @@
                 <w:sz w:val="19"/>
                 <w:szCs w:val="19"/>
               </w:rPr>
-              <w:t xml:space="preserve">Exportação em MARC21</w:t>
+              <w:t xml:space="preserve">Suporte a múltiplas unidades na mesma instalação</w:t>
             </w:r>
           </w:p>
         </w:tc>
         <w:tc>
           <w:tcPr>
             <w:tcW w:type="dxa" w:w="3826"/>
-            <w:tcMar>
-              <w:top w:type="dxa" w:w="60"/>
-              <w:left w:type="dxa" w:w="90"/>
-              <w:bottom w:type="dxa" w:w="60"/>
-              <w:right w:type="dxa" w:w="90"/>
-            </w:tcMar>
-          </w:tcPr>
-          <w:p>
-            <w:pPr>
-              <w:spacing w:after="0"/>
-            </w:pPr>
-            <w:r>
-              <w:rPr>
-                <w:b w:val="false"/>
-                <w:bCs w:val="false"/>
-                <w:sz w:val="19"/>
-                <w:szCs w:val="19"/>
-              </w:rPr>
-              <w:t xml:space="preserve">Avaliação futura, para migração a sistema profissional</w:t>
-            </w:r>
-          </w:p>
-        </w:tc>
-      </w:tr>
-      <w:tr>
-        <w:tc>
-          <w:tcPr>
-            <w:tcW w:type="dxa" w:w="5200"/>
-            <w:shd w:fill="F5F7FA" w:color="auto" w:val="clear"/>
-            <w:tcMar>
-              <w:top w:type="dxa" w:w="60"/>
-              <w:left w:type="dxa" w:w="90"/>
-              <w:bottom w:type="dxa" w:w="60"/>
-              <w:right w:type="dxa" w:w="90"/>
-            </w:tcMar>
-          </w:tcPr>
-          <w:p>
-            <w:pPr>
-              <w:spacing w:after="0"/>
-            </w:pPr>
-            <w:r>
-              <w:rPr>
-                <w:b w:val="false"/>
-                <w:bCs w:val="false"/>
-                <w:sz w:val="19"/>
-                <w:szCs w:val="19"/>
-              </w:rPr>
-              <w:t xml:space="preserve">Suporte a múltiplas unidades na mesma instalação</w:t>
-            </w:r>
-          </w:p>
-        </w:tc>
-        <w:tc>
-          <w:tcPr>
-            <w:tcW w:type="dxa" w:w="3826"/>
-            <w:shd w:fill="F5F7FA" w:color="auto" w:val="clear"/>
             <w:tcMar>
               <w:top w:type="dxa" w:w="60"/>
               <w:left w:type="dxa" w:w="90"/>

</xml_diff>